<commit_message>
update workJo add unité decoulement
</commit_message>
<xml_diff>
--- a/WorkJo.docx
+++ b/WorkJo.docx
@@ -7,42 +7,40 @@
         <w:rPr>
           <w:b/>
           <w:bCs/>
-        </w:rPr>
-      </w:pPr>
-      <w:r>
-        <w:rPr>
-          <w:b/>
-          <w:bCs/>
-        </w:rPr>
-        <w:t xml:space="preserve">4 - </w:t>
-      </w:r>
-      <w:r>
-        <w:rPr>
-          <w:b/>
-          <w:bCs/>
-        </w:rPr>
-        <w:t>CORE LOOP</w:t>
-      </w:r>
-    </w:p>
-    <w:p>
-      <w:pPr>
-        <w:rPr>
-          <w:b/>
-          <w:bCs/>
-        </w:rPr>
-      </w:pPr>
-    </w:p>
-    <w:p>
-      <w:pPr>
-        <w:rPr>
-          <w:b/>
-          <w:bCs/>
-        </w:rPr>
-      </w:pPr>
-      <w:r>
-        <w:rPr>
-          <w:b/>
-          <w:bCs/>
+          <w:lang w:val="en-US"/>
+        </w:rPr>
+      </w:pPr>
+      <w:r>
+        <w:rPr>
+          <w:b/>
+          <w:bCs/>
+          <w:lang w:val="en-US"/>
+        </w:rPr>
+        <w:t>4 - CORE LOOP</w:t>
+      </w:r>
+    </w:p>
+    <w:p>
+      <w:pPr>
+        <w:rPr>
+          <w:b/>
+          <w:bCs/>
+          <w:lang w:val="en-US"/>
+        </w:rPr>
+      </w:pPr>
+    </w:p>
+    <w:p>
+      <w:pPr>
+        <w:rPr>
+          <w:b/>
+          <w:bCs/>
+          <w:lang w:val="en-US"/>
+        </w:rPr>
+      </w:pPr>
+      <w:r>
+        <w:rPr>
+          <w:b/>
+          <w:bCs/>
+          <w:lang w:val="en-US"/>
         </w:rPr>
         <w:t>A) Gameplay &amp; les 3C</w:t>
       </w:r>
@@ -421,21 +419,7 @@
         <w:rPr>
           <w:lang w:eastAsia="en-US"/>
         </w:rPr>
-        <w:t xml:space="preserve">peut parcourir la carte de la planète sur laquelle vit la civilisation en vue </w:t>
-      </w:r>
-      <w:proofErr w:type="spellStart"/>
-      <w:r>
-        <w:rPr>
-          <w:lang w:eastAsia="en-US"/>
-        </w:rPr>
-        <w:t>Topdown</w:t>
-      </w:r>
-      <w:proofErr w:type="spellEnd"/>
-      <w:r>
-        <w:rPr>
-          <w:lang w:eastAsia="en-US"/>
-        </w:rPr>
-        <w:t>. Le joueur à accès également à des évènements qui se font hors champs de caméra. Cela permet au joueur d’identifier la localisation précise de ces derniers</w:t>
+        <w:t>peut parcourir la carte de la planète sur laquelle vit la civilisation en vue Topdown. Le joueur à accès également à des évènements qui se font hors champs de caméra. Cela permet au joueur d’identifier la localisation précise de ces derniers</w:t>
       </w:r>
       <w:r>
         <w:rPr>
@@ -591,30 +575,8 @@
         <w:rPr>
           <w:lang w:eastAsia="en-US"/>
         </w:rPr>
-        <w:t xml:space="preserve">Déplacement de l’écran sur l’axe X et Y de la carte : </w:t>
-      </w:r>
-      <w:proofErr w:type="gramStart"/>
-      <w:r>
-        <w:rPr>
-          <w:lang w:eastAsia="en-US"/>
-        </w:rPr>
-        <w:t>Z,Q</w:t>
-      </w:r>
-      <w:proofErr w:type="gramEnd"/>
-      <w:r>
-        <w:rPr>
-          <w:lang w:eastAsia="en-US"/>
-        </w:rPr>
-        <w:t>,</w:t>
-      </w:r>
-      <w:proofErr w:type="gramStart"/>
-      <w:r>
-        <w:rPr>
-          <w:lang w:eastAsia="en-US"/>
-        </w:rPr>
-        <w:t>S,D</w:t>
-      </w:r>
-      <w:proofErr w:type="gramEnd"/>
+        <w:t>Déplacement de l’écran sur l’axe X et Y de la carte : Z,Q,S,D</w:t>
+      </w:r>
       <w:r>
         <w:rPr>
           <w:lang w:eastAsia="en-US"/>
@@ -836,21 +798,7 @@
           <w:bCs/>
         </w:rPr>
         <w:lastRenderedPageBreak/>
-        <w:t>B</w:t>
-      </w:r>
-      <w:r>
-        <w:rPr>
-          <w:b/>
-          <w:bCs/>
-        </w:rPr>
-        <w:t xml:space="preserve">) </w:t>
-      </w:r>
-      <w:r>
-        <w:rPr>
-          <w:b/>
-          <w:bCs/>
-        </w:rPr>
-        <w:t>Boucles micro et macro</w:t>
+        <w:t>B) Boucles micro et macro</w:t>
       </w:r>
     </w:p>
     <w:p>
@@ -1459,14 +1407,7 @@
           <w:b/>
           <w:bCs/>
         </w:rPr>
-        <w:t>C</w:t>
-      </w:r>
-      <w:r>
-        <w:rPr>
-          <w:b/>
-          <w:bCs/>
-        </w:rPr>
-        <w:t xml:space="preserve">) </w:t>
+        <w:t xml:space="preserve">C) </w:t>
       </w:r>
       <w:r>
         <w:rPr>
@@ -1592,31 +1533,15 @@
           <w:b/>
           <w:bCs/>
         </w:rPr>
-        <w:t>D</w:t>
-      </w:r>
-      <w:r>
-        <w:rPr>
-          <w:b/>
-          <w:bCs/>
-        </w:rPr>
-        <w:t xml:space="preserve">) </w:t>
-      </w:r>
-      <w:r>
-        <w:rPr>
-          <w:b/>
-          <w:bCs/>
-        </w:rPr>
-        <w:t xml:space="preserve">L’outil de jeu </w:t>
-      </w:r>
-      <w:proofErr w:type="gramStart"/>
-      <w:r>
-        <w:rPr>
-          <w:b/>
-          <w:bCs/>
-        </w:rPr>
-        <w:t>coopératif:</w:t>
-      </w:r>
-      <w:proofErr w:type="gramEnd"/>
+        <w:t xml:space="preserve">D) L’outil de jeu </w:t>
+      </w:r>
+      <w:r>
+        <w:rPr>
+          <w:b/>
+          <w:bCs/>
+        </w:rPr>
+        <w:t>coopératif :</w:t>
+      </w:r>
       <w:r>
         <w:rPr>
           <w:b/>
@@ -1922,84 +1847,317 @@
     </w:p>
     <w:p>
       <w:r>
-        <w:t xml:space="preserve">Le joueur doit en permanence tester des interactions qui lui paraissent plausibles en échangeant avec les autres joueurs. </w:t>
-      </w:r>
-    </w:p>
-    <w:p>
-      <w:pPr>
-        <w:rPr>
-          <w:b/>
-          <w:bCs/>
-        </w:rPr>
-      </w:pPr>
-      <w:r>
-        <w:rPr>
-          <w:b/>
-          <w:bCs/>
-        </w:rPr>
-        <w:t xml:space="preserve"> </w:t>
-      </w:r>
-    </w:p>
-    <w:p>
-      <w:pPr>
-        <w:rPr>
-          <w:b/>
-          <w:bCs/>
-        </w:rPr>
-      </w:pPr>
-      <w:r>
-        <w:rPr>
-          <w:b/>
-          <w:bCs/>
-        </w:rPr>
-        <w:t xml:space="preserve">6 </w:t>
-      </w:r>
-      <w:r>
-        <w:rPr>
-          <w:b/>
-          <w:bCs/>
-        </w:rPr>
-        <w:t>–</w:t>
-      </w:r>
-      <w:r>
-        <w:rPr>
-          <w:b/>
-          <w:bCs/>
-        </w:rPr>
-        <w:t xml:space="preserve"> </w:t>
-      </w:r>
-      <w:r>
-        <w:rPr>
-          <w:b/>
-          <w:bCs/>
-        </w:rPr>
-        <w:t>ECONMIE ET EQUILIBRAGE</w:t>
+        <w:t xml:space="preserve">Les joueurs peuvent crée une partie en déterminant plusieurs paramètres : </w:t>
+      </w:r>
+      <w:r>
+        <w:rPr>
+          <w:b/>
+          <w:bCs/>
+        </w:rPr>
+        <w:t>le nombre de joueurs</w:t>
+      </w:r>
+      <w:r>
+        <w:rPr>
+          <w:b/>
+          <w:bCs/>
+        </w:rPr>
+        <w:t xml:space="preserve"> </w:t>
+      </w:r>
+      <w:r>
+        <w:t>participant à une partie</w:t>
+      </w:r>
+      <w:r>
+        <w:t xml:space="preserve"> ainsi que </w:t>
+      </w:r>
+      <w:r>
+        <w:rPr>
+          <w:b/>
+          <w:bCs/>
+        </w:rPr>
+        <w:t>l’unité d</w:t>
+      </w:r>
+      <w:r>
+        <w:rPr>
+          <w:b/>
+          <w:bCs/>
+        </w:rPr>
+        <w:t>’</w:t>
+      </w:r>
+      <w:r>
+        <w:rPr>
+          <w:b/>
+          <w:bCs/>
+        </w:rPr>
+        <w:t>écoule</w:t>
+      </w:r>
+      <w:r>
+        <w:rPr>
+          <w:b/>
+          <w:bCs/>
+        </w:rPr>
+        <w:t>me</w:t>
+      </w:r>
+      <w:r>
+        <w:rPr>
+          <w:b/>
+          <w:bCs/>
+        </w:rPr>
+        <w:t>nt d</w:t>
+      </w:r>
+      <w:r>
+        <w:rPr>
+          <w:b/>
+          <w:bCs/>
+        </w:rPr>
+        <w:t>u</w:t>
+      </w:r>
+      <w:r>
+        <w:rPr>
+          <w:b/>
+          <w:bCs/>
+        </w:rPr>
+        <w:t xml:space="preserve"> temps</w:t>
+      </w:r>
+      <w:r>
+        <w:t>. Pour cette dernière</w:t>
+      </w:r>
+      <w:r>
+        <w:t>,</w:t>
+      </w:r>
+      <w:r>
+        <w:t xml:space="preserve"> </w:t>
+      </w:r>
+      <w:r>
+        <w:t xml:space="preserve">si les joueurs sont experts, ils </w:t>
+      </w:r>
+      <w:r>
+        <w:t xml:space="preserve">peuvent décider </w:t>
+      </w:r>
+      <w:r>
+        <w:t>que</w:t>
+      </w:r>
+      <w:r>
+        <w:t xml:space="preserve"> 24 heures dans </w:t>
+      </w:r>
+      <w:r>
+        <w:t>la vie réelle</w:t>
+      </w:r>
+      <w:r>
+        <w:t xml:space="preserve"> sont </w:t>
+      </w:r>
+      <w:r>
+        <w:t>égales</w:t>
+      </w:r>
+      <w:r>
+        <w:t xml:space="preserve"> à 24 heures dans </w:t>
+      </w:r>
+      <w:r>
+        <w:t xml:space="preserve">le jeu. Si les joueurs sont débutants, ils pourront décider que 24h dans le jeu correspond à une minute. </w:t>
       </w:r>
     </w:p>
     <w:p/>
     <w:p>
       <w:r>
+        <w:t>La décision centrale repose sur le fait qu’un</w:t>
+      </w:r>
+      <w:r>
+        <w:t xml:space="preserve"> joueur doit en permanence tester des interactions qui lui paraissent plausibles en </w:t>
+      </w:r>
+      <w:r>
+        <w:t>communiquant</w:t>
+      </w:r>
+      <w:r>
+        <w:t xml:space="preserve"> avec les autres joueurs</w:t>
+      </w:r>
+      <w:r>
+        <w:t xml:space="preserve"> de sa partie.</w:t>
+      </w:r>
+    </w:p>
+    <w:p/>
+    <w:p>
+      <w:r>
+        <w:t xml:space="preserve">Les décisions sont difficiles à prendre, car l’expérience de la partie des autres joueurs seront nécessaire pour entreprendre des interactions réussies. Ces mêmes expériences </w:t>
+      </w:r>
+      <w:r>
+        <w:t>obligeront donc les joueurs</w:t>
+      </w:r>
+      <w:r>
+        <w:t xml:space="preserve"> à communiquer</w:t>
+      </w:r>
+      <w:r>
+        <w:t xml:space="preserve"> clairement via l’outil en jeu du carnet de recherches (onglet hypothèses/notes) ou via d’autre outils de communication hors du jeu comme discord. </w:t>
+      </w:r>
+    </w:p>
+    <w:p>
+      <w:r>
+        <w:t>Les joueurs devront toujours avoir un œil sur le carnet de recherches, notamment sur son historique. En effet le but et de savoir quelles interactions ont déjà été effectuées par les autres joueurs pour savoir si certaines ont échouées ne pas les reproduire.</w:t>
+      </w:r>
+    </w:p>
+    <w:p>
+      <w:pPr>
+        <w:rPr>
+          <w:b/>
+          <w:bCs/>
+        </w:rPr>
+      </w:pPr>
+      <w:r>
+        <w:rPr>
+          <w:b/>
+          <w:bCs/>
+        </w:rPr>
+        <w:t xml:space="preserve"> </w:t>
+      </w:r>
+    </w:p>
+    <w:p>
+      <w:pPr>
+        <w:rPr>
+          <w:b/>
+          <w:bCs/>
+        </w:rPr>
+      </w:pPr>
+      <w:r>
+        <w:rPr>
+          <w:b/>
+          <w:bCs/>
+        </w:rPr>
+        <w:t>6 – ECON</w:t>
+      </w:r>
+      <w:r>
+        <w:rPr>
+          <w:b/>
+          <w:bCs/>
+        </w:rPr>
+        <w:t>O</w:t>
+      </w:r>
+      <w:r>
+        <w:rPr>
+          <w:b/>
+          <w:bCs/>
+        </w:rPr>
+        <w:t>MIE ET EQUILIBRAGE</w:t>
+      </w:r>
+    </w:p>
+    <w:p/>
+    <w:p>
+      <w:r>
         <w:t>Il y a assez peu de rapport au chiffre dans notre genre de jeu et dans ce jeu en général. Mais on pourra tout de même noter quelques valeurs :</w:t>
       </w:r>
     </w:p>
     <w:p>
       <w:r>
-        <w:t>-le pourcentage de complétion du joueur : il commence à 0% et est considéré comme complété à 100%</w:t>
-      </w:r>
-    </w:p>
-    <w:p>
-      <w:r>
-        <w:t xml:space="preserve">-l’historique </w:t>
-      </w:r>
-      <w:proofErr w:type="gramStart"/>
-      <w:r>
-        <w:t>des interaction</w:t>
-      </w:r>
-      <w:proofErr w:type="gramEnd"/>
-      <w:r>
-        <w:t> : les joueurs pourront filtrés l’historique d’interaction et ainsi déterminer la nature mais également le nombre d’interaction réussies ou échouée</w:t>
-      </w:r>
-    </w:p>
+        <w:t>-</w:t>
+      </w:r>
+      <w:r>
+        <w:t xml:space="preserve"> </w:t>
+      </w:r>
+      <w:r>
+        <w:rPr>
+          <w:b/>
+          <w:bCs/>
+        </w:rPr>
+        <w:t xml:space="preserve">l’unité </w:t>
+      </w:r>
+      <w:r>
+        <w:rPr>
+          <w:b/>
+          <w:bCs/>
+        </w:rPr>
+        <w:t>d’écoulement</w:t>
+      </w:r>
+      <w:r>
+        <w:rPr>
+          <w:b/>
+          <w:bCs/>
+        </w:rPr>
+        <w:t xml:space="preserve"> du temps</w:t>
+      </w:r>
+      <w:r>
+        <w:rPr>
+          <w:b/>
+          <w:bCs/>
+        </w:rPr>
+        <w:t> </w:t>
+      </w:r>
+      <w:r>
+        <w:t>: p</w:t>
+      </w:r>
+      <w:r>
+        <w:t>ermet d’avoir accès à l’équivalence et au défilement du temps en jeu en fonction du temps dans la vie réelle.</w:t>
+      </w:r>
+    </w:p>
+    <w:p>
+      <w:r>
+        <w:t>-</w:t>
+      </w:r>
+      <w:r>
+        <w:t xml:space="preserve"> </w:t>
+      </w:r>
+      <w:r>
+        <w:rPr>
+          <w:b/>
+          <w:bCs/>
+        </w:rPr>
+        <w:t>le pourcentage de complétion</w:t>
+      </w:r>
+      <w:r>
+        <w:rPr>
+          <w:b/>
+          <w:bCs/>
+        </w:rPr>
+        <w:t xml:space="preserve"> (du carnet de recherches)</w:t>
+      </w:r>
+      <w:r>
+        <w:rPr>
+          <w:b/>
+          <w:bCs/>
+        </w:rPr>
+        <w:t xml:space="preserve"> </w:t>
+      </w:r>
+      <w:r>
+        <w:t>: il commence à 0% et est considéré comme complété à 100%</w:t>
+      </w:r>
+    </w:p>
+    <w:p>
+      <w:r>
+        <w:t>-</w:t>
+      </w:r>
+      <w:r>
+        <w:t xml:space="preserve"> </w:t>
+      </w:r>
+      <w:r>
+        <w:rPr>
+          <w:b/>
+          <w:bCs/>
+        </w:rPr>
+        <w:t>l’historique des interaction</w:t>
+      </w:r>
+      <w:r>
+        <w:rPr>
+          <w:b/>
+          <w:bCs/>
+        </w:rPr>
+        <w:t>s</w:t>
+      </w:r>
+      <w:r>
+        <w:t xml:space="preserve"> : les joueurs pourront </w:t>
+      </w:r>
+      <w:r>
+        <w:t>filtrer</w:t>
+      </w:r>
+      <w:r>
+        <w:t xml:space="preserve"> l’historique d’interaction et ainsi déterminer la nature mais également le nombre d’interaction</w:t>
+      </w:r>
+      <w:r>
+        <w:t>s</w:t>
+      </w:r>
+      <w:r>
+        <w:t xml:space="preserve"> réussies ou échouée</w:t>
+      </w:r>
+      <w:r>
+        <w:t>.</w:t>
+      </w:r>
+    </w:p>
+    <w:p/>
     <w:p/>
     <w:p>
       <w:pPr>

</xml_diff>